<commit_message>
Unslop resume and report: remove em dashes and mid-sentence colons
Rewrites AI-pattern phrasing (em dash clause separators, non-list
colons, false ranges) in the Proton resume and coverage report.

Co-Authored-By: Claude Sonnet 5 <noreply@anthropic.com>
Claude-Session: https://claude.ai/code/session_01FJNHuRywukd7btnN4pCx9K
</commit_message>
<xml_diff>
--- a/applications/Proton_HeadOfProduct/Dorian_Moyne_Proton_HeadOfProduct_Resume.docx
+++ b/applications/Proton_HeadOfProduct/Dorian_Moyne_Proton_HeadOfProduct_Resume.docx
@@ -29,7 +29,7 @@
           <w:sz w:val="23"/>
           <w:szCs w:val="23"/>
         </w:rPr>
-        <w:t xml:space="preserve">Head of Product Leadership — Consumer Software &amp; Digital Platforms</w:t>
+        <w:t xml:space="preserve">Head of Product Leadership | Consumer Software &amp; Digital Platforms</w:t>
       </w:r>
     </w:p>
     <w:p>
@@ -78,7 +78,7 @@
           <w:sz w:val="22"/>
           <w:szCs w:val="22"/>
         </w:rPr>
-        <w:t xml:space="preserve">10+ years leading product organizations end-to-end — from strategy and roadmap to full P&amp;L ownership and team leadership — in fast-moving, resource-constrained environments. Built and led teams of Product Managers from scratch, set vision and roadmap, and translated them into results: business lines grown from $1M to $30M and $45M to $100M, with a cumulative qualified pipeline above $370M. Comfortable operating with ambiguity, making high-conviction calls, and reporting directly to executive leadership. Long-time Proton user and advocate for digital privacy and European tech sovereignty, drawn to Proton's mission of making privacy the default.</w:t>
+        <w:t xml:space="preserve">10+ years leading product organizations: strategy, roadmap, full P&amp;L ownership, and team leadership, in fast-moving, resource-constrained environments. Built and led teams of Product Managers from scratch, set vision and roadmap, and delivered results: business lines grown from $1M to $30M and from $45M to $100M, with a cumulative qualified pipeline above $370M. Comfortable operating with ambiguity, making high-conviction calls, and reporting directly to executive leadership. Long-time Proton user and advocate for digital privacy and European tech sovereignty, motivated by Proton's mission of making privacy the default.</w:t>
       </w:r>
     </w:p>
     <w:p>
@@ -193,7 +193,7 @@
           <w:sz w:val="22"/>
           <w:szCs w:val="22"/>
         </w:rPr>
-        <w:t xml:space="preserve">Selected to build a new EMEA organization from the ground up: designed and executed market entry and growth strategy end-to-end (product + commercial) with a scrappy, resource-efficient approach.</w:t>
+        <w:t xml:space="preserve">Selected to build a new EMEA organization from the ground up. Designed and executed the market entry and growth strategy (product and commercial) with a scrappy, resource-efficient approach.</w:t>
       </w:r>
     </w:p>
     <w:p>
@@ -229,7 +229,7 @@
           <w:sz w:val="22"/>
           <w:szCs w:val="22"/>
         </w:rPr>
-        <w:t xml:space="preserve">Cross-functional leadership across ~44 stakeholders: sales, 6 Product Line Managers, 25 Product Managers, operations/engineering across 3 sites — driving alignment without direct authority over most of the group.</w:t>
+        <w:t xml:space="preserve">Led cross-functional efforts across ~44 stakeholders: sales, 6 Product Line Managers, 25 Product Managers, and operations/engineering across 3 sites. Drove alignment without direct authority over most of the group.</w:t>
       </w:r>
     </w:p>
     <w:p>
@@ -311,7 +311,7 @@
           <w:sz w:val="22"/>
           <w:szCs w:val="22"/>
         </w:rPr>
-        <w:t xml:space="preserve">Full P&amp;L ownership of a $100M global product line across 3 sites (France, India, China): set the 36-month strategic roadmap and 12-month operating plan, and owned execution end-to-end.</w:t>
+        <w:t xml:space="preserve">Full P&amp;L ownership of a $100M global product line across 3 sites (France, India, China). Set the 36-month strategic roadmap and 12-month operating plan, and owned execution end-to-end.</w:t>
       </w:r>
     </w:p>
     <w:p>
@@ -347,25 +347,25 @@
           <w:sz w:val="22"/>
           <w:szCs w:val="22"/>
         </w:rPr>
-        <w:t xml:space="preserve">Defined and owned the portfolio's KPIs and held the team accountable for moving them — grew revenue from $45M to $100M ($150M projected for 2029).</w:t>
-      </w:r>
-    </w:p>
-    <w:p>
-      <w:pPr>
-        <w:pStyle w:val="ListParagraph"/>
-        <w:numPr>
-          <w:ilvl w:val="0"/>
-          <w:numId w:val="2"/>
-        </w:numPr>
-        <w:spacing w:after="40"/>
-      </w:pPr>
-      <w:r>
-        <w:rPr>
-          <w:rFonts w:ascii="Calibri" w:cs="Calibri" w:eastAsia="Calibri" w:hAnsi="Calibri"/>
-          <w:sz w:val="22"/>
-          <w:szCs w:val="22"/>
-        </w:rPr>
-        <w:t xml:space="preserve">Owned monthly reporting and roadmap rationale to the Amphenol group board, translating product strategy and tradeoffs for executive leadership.</w:t>
+        <w:t xml:space="preserve">Defined and owned the portfolio's KPIs and held the team accountable for moving them. Grew revenue from $45M to $100M, with $150M projected for 2029.</w:t>
+      </w:r>
+    </w:p>
+    <w:p>
+      <w:pPr>
+        <w:pStyle w:val="ListParagraph"/>
+        <w:numPr>
+          <w:ilvl w:val="0"/>
+          <w:numId w:val="2"/>
+        </w:numPr>
+        <w:spacing w:after="40"/>
+      </w:pPr>
+      <w:r>
+        <w:rPr>
+          <w:rFonts w:ascii="Calibri" w:cs="Calibri" w:eastAsia="Calibri" w:hAnsi="Calibri"/>
+          <w:sz w:val="22"/>
+          <w:szCs w:val="22"/>
+        </w:rPr>
+        <w:t xml:space="preserve">Presented monthly roadmap and strategy updates, including tradeoffs, to the Amphenol group board for executive decision-making.</w:t>
       </w:r>
     </w:p>
     <w:p>
@@ -611,7 +611,7 @@
           <w:sz w:val="22"/>
           <w:szCs w:val="22"/>
         </w:rPr>
-        <w:t xml:space="preserve">Progressed from process engineering to product development, building the technical grounding (FEA simulation, materials, industrialization) that underpins later product leadership roles.</w:t>
+        <w:t xml:space="preserve">Progressed from process engineering to product development, working on FEA simulation, materials, and industrialization. This technical background underpins the later product leadership roles above.</w:t>
       </w:r>
     </w:p>
     <w:p>

</xml_diff>

<commit_message>
Remove short Strategy BDM stint, extend Group Product Manager to present
Candidate returned to the Group Product Manager role (internally also
called Product Line Manager) after a brief BDM stint too short to be
worth a separate line. Updated across the resume library and the
Proton application resume; the report notes the change for traceability.

Co-Authored-By: Claude Sonnet 5 <noreply@anthropic.com>
Claude-Session: https://claude.ai/code/session_01FJNHuRywukd7btnN4pCx9K
</commit_message>
<xml_diff>
--- a/applications/Proton_HeadOfProduct/Dorian_Moyne_Proton_HeadOfProduct_Resume.docx
+++ b/applications/Proton_HeadOfProduct/Dorian_Moyne_Proton_HeadOfProduct_Resume.docx
@@ -148,7 +148,7 @@
           <w:sz w:val="23"/>
           <w:szCs w:val="23"/>
         </w:rPr>
-        <w:t xml:space="preserve">Strategy Business Development Manager</w:t>
+        <w:t xml:space="preserve">Group Product Manager</w:t>
       </w:r>
       <w:r>
         <w:rPr>
@@ -159,125 +159,7 @@
           <w:sz w:val="21"/>
           <w:szCs w:val="21"/>
         </w:rPr>
-        <w:t xml:space="preserve">	May 2026 – Present</w:t>
-      </w:r>
-    </w:p>
-    <w:p>
-      <w:pPr>
-        <w:spacing w:after="60"/>
-      </w:pPr>
-      <w:r>
-        <w:rPr>
-          <w:rFonts w:ascii="Calibri" w:cs="Calibri" w:eastAsia="Calibri" w:hAnsi="Calibri"/>
-          <w:i/>
-          <w:iCs/>
-          <w:color w:val="444444"/>
-          <w:sz w:val="21"/>
-          <w:szCs w:val="21"/>
-        </w:rPr>
-        <w:t xml:space="preserve">Amphenol – Remote</w:t>
-      </w:r>
-    </w:p>
-    <w:p>
-      <w:pPr>
-        <w:pStyle w:val="ListParagraph"/>
-        <w:numPr>
-          <w:ilvl w:val="0"/>
-          <w:numId w:val="2"/>
-        </w:numPr>
-        <w:spacing w:after="40"/>
-      </w:pPr>
-      <w:r>
-        <w:rPr>
-          <w:rFonts w:ascii="Calibri" w:cs="Calibri" w:eastAsia="Calibri" w:hAnsi="Calibri"/>
-          <w:sz w:val="22"/>
-          <w:szCs w:val="22"/>
-        </w:rPr>
-        <w:t xml:space="preserve">Selected to build a new EMEA organization from the ground up. Designed and executed the market entry and growth strategy (product and commercial) with a scrappy, resource-efficient approach.</w:t>
-      </w:r>
-    </w:p>
-    <w:p>
-      <w:pPr>
-        <w:pStyle w:val="ListParagraph"/>
-        <w:numPr>
-          <w:ilvl w:val="0"/>
-          <w:numId w:val="2"/>
-        </w:numPr>
-        <w:spacing w:after="40"/>
-      </w:pPr>
-      <w:r>
-        <w:rPr>
-          <w:rFonts w:ascii="Calibri" w:cs="Calibri" w:eastAsia="Calibri" w:hAnsi="Calibri"/>
-          <w:sz w:val="22"/>
-          <w:szCs w:val="22"/>
-        </w:rPr>
-        <w:t xml:space="preserve">Own a portfolio of €80M pipeline and €20M revenue across 7 product families, prioritizing and making high-conviction calls on where to focus with limited resources.</w:t>
-      </w:r>
-    </w:p>
-    <w:p>
-      <w:pPr>
-        <w:pStyle w:val="ListParagraph"/>
-        <w:numPr>
-          <w:ilvl w:val="0"/>
-          <w:numId w:val="2"/>
-        </w:numPr>
-        <w:spacing w:after="40"/>
-      </w:pPr>
-      <w:r>
-        <w:rPr>
-          <w:rFonts w:ascii="Calibri" w:cs="Calibri" w:eastAsia="Calibri" w:hAnsi="Calibri"/>
-          <w:sz w:val="22"/>
-          <w:szCs w:val="22"/>
-        </w:rPr>
-        <w:t xml:space="preserve">Led cross-functional efforts across ~44 stakeholders: sales, 6 Product Line Managers, 25 Product Managers, and operations/engineering across 3 sites. Drove alignment without direct authority over most of the group.</w:t>
-      </w:r>
-    </w:p>
-    <w:p>
-      <w:pPr>
-        <w:pStyle w:val="ListParagraph"/>
-        <w:numPr>
-          <w:ilvl w:val="0"/>
-          <w:numId w:val="2"/>
-        </w:numPr>
-        <w:spacing w:after="40"/>
-      </w:pPr>
-      <w:r>
-        <w:rPr>
-          <w:rFonts w:ascii="Calibri" w:cs="Calibri" w:eastAsia="Calibri" w:hAnsi="Calibri"/>
-          <w:sz w:val="22"/>
-          <w:szCs w:val="22"/>
-        </w:rPr>
-        <w:t xml:space="preserve">Personally generated €20M of incremental pipeline, converting €6M into design wins; reactivated dormant accounts and grew strategic key accounts.</w:t>
-      </w:r>
-    </w:p>
-    <w:p>
-      <w:pPr>
-        <w:tabs>
-          <w:tab w:val="right" w:pos="9936"/>
-        </w:tabs>
-        <w:spacing w:after="20" w:before="140"/>
-      </w:pPr>
-      <w:r>
-        <w:rPr>
-          <w:rFonts w:ascii="Calibri" w:cs="Calibri" w:eastAsia="Calibri" w:hAnsi="Calibri"/>
-          <w:b/>
-          <w:bCs/>
-          <w:color w:val="1A1A1A"/>
-          <w:sz w:val="23"/>
-          <w:szCs w:val="23"/>
-        </w:rPr>
-        <w:t xml:space="preserve">Group Product Manager</w:t>
-      </w:r>
-      <w:r>
-        <w:rPr>
-          <w:rFonts w:ascii="Calibri" w:cs="Calibri" w:eastAsia="Calibri" w:hAnsi="Calibri"/>
-          <w:i/>
-          <w:iCs/>
-          <w:color w:val="444444"/>
-          <w:sz w:val="21"/>
-          <w:szCs w:val="21"/>
-        </w:rPr>
-        <w:t xml:space="preserve">	June 2024 – May 2026</w:t>
+        <w:t xml:space="preserve">	June 2024 – Present</w:t>
       </w:r>
     </w:p>
     <w:p>

</xml_diff>